<commit_message>
Added debugging assignment code and report
</commit_message>
<xml_diff>
--- a/Debugging_Exercise/MariaGalante_Debugging_Report.docx
+++ b/Debugging_Exercise/MariaGalante_Debugging_Report.docx
@@ -29,9 +29,6 @@
     </w:p>
     <w:p>
       <w:r>
-        <w:t xml:space="preserve">Program Description: </w:t>
-      </w:r>
-      <w:r>
         <w:t xml:space="preserve">The </w:t>
       </w:r>
       <w:r>
@@ -41,7 +38,10 @@
         <w:t xml:space="preserve"> happened</w:t>
       </w:r>
       <w:r>
-        <w:t xml:space="preserve"> due to inconsistent data types. </w:t>
+        <w:t xml:space="preserve"> because of </w:t>
+      </w:r>
+      <w:r>
+        <w:t xml:space="preserve">inconsistent data types. </w:t>
       </w:r>
       <w:r>
         <w:t>The inconsistent data type was the price value for the Tablet</w:t>
@@ -61,13 +61,8 @@
       <w:r>
         <w:t xml:space="preserve"> the </w:t>
       </w:r>
-      <w:proofErr w:type="spellStart"/>
-      <w:r>
-        <w:t>TypeErrors</w:t>
-      </w:r>
-      <w:proofErr w:type="spellEnd"/>
-      <w:r>
-        <w:t xml:space="preserve"> because the program </w:t>
+      <w:r>
+        <w:t xml:space="preserve">TypeErrors because the program </w:t>
       </w:r>
       <w:r>
         <w:t xml:space="preserve">tried </w:t>
@@ -79,25 +74,37 @@
         <w:t xml:space="preserve"> </w:t>
       </w:r>
       <w:r>
-        <w:t xml:space="preserve">The debugging process was used to </w:t>
+        <w:t>I used the</w:t>
+      </w:r>
+      <w:r>
+        <w:t xml:space="preserve"> debugging to </w:t>
       </w:r>
       <w:r>
         <w:t xml:space="preserve">find </w:t>
       </w:r>
       <w:r>
-        <w:t>these errors</w:t>
+        <w:t>the</w:t>
+      </w:r>
+      <w:r>
+        <w:t xml:space="preserve"> </w:t>
+      </w:r>
+      <w:r>
+        <w:t>errors</w:t>
       </w:r>
       <w:r>
         <w:t>, where to fix the code,</w:t>
       </w:r>
       <w:r>
-        <w:t xml:space="preserve"> improve error handling</w:t>
-      </w:r>
-      <w:r>
-        <w:t xml:space="preserve"> with error messages </w:t>
-      </w:r>
-      <w:r>
-        <w:t>and verify correct program behavior.</w:t>
+        <w:t xml:space="preserve"> and where to add </w:t>
+      </w:r>
+      <w:r>
+        <w:t>error handling</w:t>
+      </w:r>
+      <w:r>
+        <w:t xml:space="preserve"> with error messages</w:t>
+      </w:r>
+      <w:r>
+        <w:t>.</w:t>
       </w:r>
     </w:p>
     <w:p>
@@ -125,7 +132,19 @@
         <w:rPr>
           <w:color w:val="auto"/>
         </w:rPr>
-        <w:t>Step 1: Identify Initial Error</w:t>
+        <w:t xml:space="preserve">Step 1: Identify </w:t>
+      </w:r>
+      <w:r>
+        <w:rPr>
+          <w:color w:val="auto"/>
+        </w:rPr>
+        <w:t>first</w:t>
+      </w:r>
+      <w:r>
+        <w:rPr>
+          <w:color w:val="auto"/>
+        </w:rPr>
+        <w:t xml:space="preserve"> Error</w:t>
       </w:r>
     </w:p>
     <w:p>
@@ -133,15 +152,7 @@
         <w:t>I placed a b</w:t>
       </w:r>
       <w:r>
-        <w:t>reakpoint on the following line inside the calculate_</w:t>
-      </w:r>
-      <w:proofErr w:type="gramStart"/>
-      <w:r>
-        <w:t>discount(</w:t>
-      </w:r>
-      <w:proofErr w:type="gramEnd"/>
-      <w:r>
-        <w:t>) function:</w:t>
+        <w:t>reakpoint on the following line inside the calculate_discount() function:</w:t>
       </w:r>
     </w:p>
     <w:p>
@@ -236,23 +247,7 @@
         <w:t xml:space="preserve">appeared beside </w:t>
       </w:r>
       <w:r>
-        <w:t xml:space="preserve">the </w:t>
-      </w:r>
-      <w:proofErr w:type="spellStart"/>
-      <w:r>
-        <w:t>apply_</w:t>
-      </w:r>
-      <w:proofErr w:type="gramStart"/>
-      <w:r>
-        <w:t>discount</w:t>
-      </w:r>
-      <w:proofErr w:type="spellEnd"/>
-      <w:r>
-        <w:t>(</w:t>
-      </w:r>
-      <w:proofErr w:type="gramEnd"/>
-      <w:r>
-        <w:t>) function at the following line:</w:t>
+        <w:t>the apply_discount() function at the following line:</w:t>
       </w:r>
     </w:p>
     <w:p>
@@ -344,7 +339,7 @@
         <w:ind w:left="720"/>
       </w:pPr>
       <w:r>
-        <w:t>- Converted price and discount_rate values to float before performing calculations.</w:t>
+        <w:t>- Converted price and discount_rate values to float before calculations.</w:t>
       </w:r>
     </w:p>
     <w:p>
@@ -383,15 +378,10 @@
         <w:t>made sure</w:t>
       </w:r>
       <w:r>
-        <w:t xml:space="preserve"> </w:t>
-      </w:r>
-      <w:proofErr w:type="spellStart"/>
-      <w:r>
-        <w:t>discount_rate</w:t>
-      </w:r>
-      <w:proofErr w:type="spellEnd"/>
-      <w:r>
-        <w:t xml:space="preserve"> values remain between 0 and 1.</w:t>
+        <w:t xml:space="preserve"> discount_rate values remain between 0 and 1</w:t>
+      </w:r>
+      <w:r>
+        <w:t xml:space="preserve"> (so people wouldn’t accidentally put *2 and get a 200% discount etc).</w:t>
       </w:r>
     </w:p>
     <w:p>
@@ -412,13 +402,17 @@
         <w:ind w:left="720"/>
       </w:pPr>
       <w:r>
+        <w:lastRenderedPageBreak/>
         <w:t xml:space="preserve">- </w:t>
       </w:r>
       <w:r>
         <w:t xml:space="preserve">put in </w:t>
       </w:r>
       <w:r>
-        <w:t>meaningful error messages for invalid input</w:t>
+        <w:t xml:space="preserve">meaningful </w:t>
+      </w:r>
+      <w:r>
+        <w:t>error messages for invalid input</w:t>
       </w:r>
       <w:r>
         <w:t>s</w:t>
@@ -429,7 +423,6 @@
     </w:p>
     <w:p>
       <w:r>
-        <w:lastRenderedPageBreak/>
         <w:t>4. Consistent Type Handling</w:t>
       </w:r>
     </w:p>
@@ -438,23 +431,7 @@
         <w:ind w:firstLine="720"/>
       </w:pPr>
       <w:r>
-        <w:t xml:space="preserve">- Updated </w:t>
-      </w:r>
-      <w:proofErr w:type="spellStart"/>
-      <w:r>
-        <w:t>apply_</w:t>
-      </w:r>
-      <w:proofErr w:type="gramStart"/>
-      <w:r>
-        <w:t>discount</w:t>
-      </w:r>
-      <w:proofErr w:type="spellEnd"/>
-      <w:r>
-        <w:t>(</w:t>
-      </w:r>
-      <w:proofErr w:type="gramEnd"/>
-      <w:r>
-        <w:t>) to convert price to float before subtraction.</w:t>
+        <w:t>- Updated apply_discount() to convert price to float before subtraction.</w:t>
       </w:r>
     </w:p>
     <w:p>
@@ -505,10 +482,13 @@
         <w:t xml:space="preserve">had originally </w:t>
       </w:r>
       <w:r>
-        <w:t xml:space="preserve">caused runtime errors. The program </w:t>
-      </w:r>
-      <w:r>
-        <w:t>was completed</w:t>
+        <w:t>caused runtime errors. The program</w:t>
+      </w:r>
+      <w:r>
+        <w:t xml:space="preserve"> </w:t>
+      </w:r>
+      <w:r>
+        <w:t>completed</w:t>
       </w:r>
       <w:r>
         <w:t xml:space="preserve"> without crashing</w:t>
@@ -568,68 +548,439 @@
       <w:pPr>
         <w:pStyle w:val="Heading2"/>
         <w:rPr>
+          <w:rFonts w:asciiTheme="minorHAnsi" w:hAnsiTheme="minorHAnsi"/>
+          <w:b w:val="0"/>
+          <w:bCs w:val="0"/>
+          <w:color w:val="auto"/>
+          <w:sz w:val="22"/>
+          <w:szCs w:val="22"/>
+        </w:rPr>
+      </w:pPr>
+    </w:p>
+    <w:p>
+      <w:pPr>
+        <w:pStyle w:val="Heading2"/>
+        <w:spacing w:line="240" w:lineRule="auto"/>
+        <w:rPr>
+          <w:rFonts w:cstheme="majorHAnsi"/>
           <w:color w:val="auto"/>
         </w:rPr>
       </w:pPr>
       <w:r>
         <w:rPr>
+          <w:rFonts w:cstheme="majorHAnsi"/>
           <w:color w:val="auto"/>
         </w:rPr>
-        <w:t>Conclusion</w:t>
+        <w:t>Error Handling Results</w:t>
       </w:r>
     </w:p>
     <w:p>
-      <w:r>
-        <w:t xml:space="preserve">The debugging process identified two </w:t>
-      </w:r>
-      <w:proofErr w:type="spellStart"/>
-      <w:r>
-        <w:t>TypeErrors</w:t>
-      </w:r>
-      <w:proofErr w:type="spellEnd"/>
-      <w:r>
-        <w:t xml:space="preserve"> caused by</w:t>
-      </w:r>
-      <w:r>
-        <w:t xml:space="preserve"> the</w:t>
-      </w:r>
-      <w:r>
-        <w:t xml:space="preserve"> inconsistent data types</w:t>
-      </w:r>
-      <w:r>
-        <w:t xml:space="preserve"> (string and float)</w:t>
-      </w:r>
-      <w:r>
-        <w:t xml:space="preserve"> Using PyCharm’s debugging tools allowed </w:t>
-      </w:r>
-      <w:proofErr w:type="spellStart"/>
-      <w:r>
-        <w:t>mr</w:t>
-      </w:r>
-      <w:proofErr w:type="spellEnd"/>
-      <w:r>
-        <w:t xml:space="preserve"> to inspect the </w:t>
-      </w:r>
-      <w:r>
-        <w:t>variable</w:t>
-      </w:r>
-      <w:r>
-        <w:t xml:space="preserve">s and find the exact </w:t>
-      </w:r>
-      <w:r>
-        <w:t>error location. After</w:t>
-      </w:r>
-      <w:r>
-        <w:t xml:space="preserve"> putting </w:t>
-      </w:r>
-      <w:r>
-        <w:t xml:space="preserve">input validation, type conversion, and error handling, the program now runs and produces </w:t>
-      </w:r>
-      <w:r>
-        <w:t xml:space="preserve">the </w:t>
-      </w:r>
-      <w:r>
-        <w:t>correct output.</w:t>
+      <w:pPr>
+        <w:pStyle w:val="Heading2"/>
+        <w:rPr>
+          <w:rFonts w:cstheme="majorHAnsi"/>
+          <w:color w:val="auto"/>
+        </w:rPr>
+      </w:pPr>
+      <w:r>
+        <w:rPr>
+          <w:rFonts w:asciiTheme="minorHAnsi" w:hAnsiTheme="minorHAnsi"/>
+          <w:b w:val="0"/>
+          <w:bCs w:val="0"/>
+          <w:color w:val="auto"/>
+          <w:sz w:val="22"/>
+          <w:szCs w:val="22"/>
+        </w:rPr>
+        <w:t xml:space="preserve">I did </w:t>
+      </w:r>
+      <w:r>
+        <w:rPr>
+          <w:rFonts w:asciiTheme="minorHAnsi" w:hAnsiTheme="minorHAnsi"/>
+          <w:b w:val="0"/>
+          <w:bCs w:val="0"/>
+          <w:color w:val="auto"/>
+          <w:sz w:val="22"/>
+          <w:szCs w:val="22"/>
+        </w:rPr>
+        <w:t xml:space="preserve">another test but this time I </w:t>
+      </w:r>
+      <w:r>
+        <w:rPr>
+          <w:rFonts w:asciiTheme="minorHAnsi" w:hAnsiTheme="minorHAnsi"/>
+          <w:b w:val="0"/>
+          <w:bCs w:val="0"/>
+          <w:color w:val="auto"/>
+          <w:sz w:val="22"/>
+          <w:szCs w:val="22"/>
+        </w:rPr>
+        <w:t xml:space="preserve">purposely put in </w:t>
+      </w:r>
+      <w:r>
+        <w:rPr>
+          <w:rFonts w:asciiTheme="minorHAnsi" w:hAnsiTheme="minorHAnsi"/>
+          <w:b w:val="0"/>
+          <w:bCs w:val="0"/>
+          <w:color w:val="auto"/>
+          <w:sz w:val="22"/>
+          <w:szCs w:val="22"/>
+        </w:rPr>
+        <w:t xml:space="preserve">invalid input values. </w:t>
+      </w:r>
+    </w:p>
+    <w:p>
+      <w:pPr>
+        <w:pStyle w:val="Heading2"/>
+        <w:spacing w:before="0"/>
+        <w:rPr>
+          <w:rFonts w:asciiTheme="minorHAnsi" w:hAnsiTheme="minorHAnsi"/>
+          <w:b w:val="0"/>
+          <w:bCs w:val="0"/>
+          <w:color w:val="auto"/>
+          <w:sz w:val="22"/>
+          <w:szCs w:val="22"/>
+        </w:rPr>
+      </w:pPr>
+      <w:r>
+        <w:rPr>
+          <w:rFonts w:asciiTheme="minorHAnsi" w:hAnsiTheme="minorHAnsi"/>
+          <w:b w:val="0"/>
+          <w:bCs w:val="0"/>
+          <w:color w:val="auto"/>
+          <w:sz w:val="22"/>
+          <w:szCs w:val="22"/>
+        </w:rPr>
+        <w:t xml:space="preserve">I added a </w:t>
+      </w:r>
+      <w:r>
+        <w:rPr>
+          <w:rFonts w:asciiTheme="minorHAnsi" w:hAnsiTheme="minorHAnsi"/>
+          <w:b w:val="0"/>
+          <w:bCs w:val="0"/>
+          <w:color w:val="auto"/>
+          <w:sz w:val="22"/>
+          <w:szCs w:val="22"/>
+        </w:rPr>
+        <w:t xml:space="preserve">product with </w:t>
+      </w:r>
+      <w:r>
+        <w:rPr>
+          <w:rFonts w:asciiTheme="minorHAnsi" w:hAnsiTheme="minorHAnsi"/>
+          <w:b w:val="0"/>
+          <w:bCs w:val="0"/>
+          <w:color w:val="auto"/>
+          <w:sz w:val="22"/>
+          <w:szCs w:val="22"/>
+        </w:rPr>
+        <w:t>the price written as</w:t>
+      </w:r>
+      <w:r>
+        <w:rPr>
+          <w:rFonts w:asciiTheme="minorHAnsi" w:hAnsiTheme="minorHAnsi"/>
+          <w:b w:val="0"/>
+          <w:bCs w:val="0"/>
+          <w:color w:val="auto"/>
+          <w:sz w:val="22"/>
+          <w:szCs w:val="22"/>
+        </w:rPr>
+        <w:t xml:space="preserve"> ("</w:t>
+      </w:r>
+      <w:r>
+        <w:rPr>
+          <w:rFonts w:asciiTheme="minorHAnsi" w:hAnsiTheme="minorHAnsi"/>
+          <w:b w:val="0"/>
+          <w:bCs w:val="0"/>
+          <w:color w:val="auto"/>
+          <w:sz w:val="22"/>
+          <w:szCs w:val="22"/>
+        </w:rPr>
+        <w:t>four</w:t>
+      </w:r>
+      <w:r>
+        <w:rPr>
+          <w:rFonts w:asciiTheme="minorHAnsi" w:hAnsiTheme="minorHAnsi"/>
+          <w:b w:val="0"/>
+          <w:bCs w:val="0"/>
+          <w:color w:val="auto"/>
+          <w:sz w:val="22"/>
+          <w:szCs w:val="22"/>
+        </w:rPr>
+        <w:t xml:space="preserve"> hundred") </w:t>
+      </w:r>
+      <w:r>
+        <w:rPr>
+          <w:rFonts w:asciiTheme="minorHAnsi" w:hAnsiTheme="minorHAnsi"/>
+          <w:b w:val="0"/>
+          <w:bCs w:val="0"/>
+          <w:color w:val="auto"/>
+          <w:sz w:val="22"/>
+          <w:szCs w:val="22"/>
+        </w:rPr>
+        <w:t>and when I ran it gave me the</w:t>
+      </w:r>
+      <w:r>
+        <w:rPr>
+          <w:rFonts w:asciiTheme="minorHAnsi" w:hAnsiTheme="minorHAnsi"/>
+          <w:b w:val="0"/>
+          <w:bCs w:val="0"/>
+          <w:color w:val="auto"/>
+          <w:sz w:val="22"/>
+          <w:szCs w:val="22"/>
+        </w:rPr>
+        <w:t xml:space="preserve"> error message and was skipped without crashing the program. </w:t>
+      </w:r>
+      <w:r>
+        <w:rPr>
+          <w:rFonts w:asciiTheme="minorHAnsi" w:hAnsiTheme="minorHAnsi"/>
+          <w:b w:val="0"/>
+          <w:bCs w:val="0"/>
+          <w:color w:val="auto"/>
+          <w:sz w:val="22"/>
+          <w:szCs w:val="22"/>
+        </w:rPr>
+        <w:t xml:space="preserve"> I also added a</w:t>
+      </w:r>
+      <w:r>
+        <w:rPr>
+          <w:rFonts w:asciiTheme="minorHAnsi" w:hAnsiTheme="minorHAnsi"/>
+          <w:b w:val="0"/>
+          <w:bCs w:val="0"/>
+          <w:color w:val="auto"/>
+          <w:sz w:val="22"/>
+          <w:szCs w:val="22"/>
+        </w:rPr>
+        <w:t xml:space="preserve"> product with an invalid discount rate (2) </w:t>
+      </w:r>
+      <w:r>
+        <w:rPr>
+          <w:rFonts w:asciiTheme="minorHAnsi" w:hAnsiTheme="minorHAnsi"/>
+          <w:b w:val="0"/>
+          <w:bCs w:val="0"/>
+          <w:color w:val="auto"/>
+          <w:sz w:val="22"/>
+          <w:szCs w:val="22"/>
+        </w:rPr>
+        <w:t xml:space="preserve">this was </w:t>
+      </w:r>
+      <w:r>
+        <w:rPr>
+          <w:rFonts w:asciiTheme="minorHAnsi" w:hAnsiTheme="minorHAnsi"/>
+          <w:b w:val="0"/>
+          <w:bCs w:val="0"/>
+          <w:color w:val="auto"/>
+          <w:sz w:val="22"/>
+          <w:szCs w:val="22"/>
+        </w:rPr>
+        <w:t>skipped</w:t>
+      </w:r>
+      <w:r>
+        <w:rPr>
+          <w:rFonts w:asciiTheme="minorHAnsi" w:hAnsiTheme="minorHAnsi"/>
+          <w:b w:val="0"/>
+          <w:bCs w:val="0"/>
+          <w:color w:val="auto"/>
+          <w:sz w:val="22"/>
+          <w:szCs w:val="22"/>
+        </w:rPr>
+        <w:t xml:space="preserve"> without crashing.</w:t>
+      </w:r>
+      <w:r>
+        <w:rPr>
+          <w:rFonts w:asciiTheme="minorHAnsi" w:hAnsiTheme="minorHAnsi"/>
+          <w:b w:val="0"/>
+          <w:bCs w:val="0"/>
+          <w:color w:val="auto"/>
+          <w:sz w:val="22"/>
+          <w:szCs w:val="22"/>
+        </w:rPr>
+        <w:t xml:space="preserve"> For both </w:t>
+      </w:r>
+      <w:r>
+        <w:rPr>
+          <w:rFonts w:asciiTheme="minorHAnsi" w:hAnsiTheme="minorHAnsi"/>
+          <w:b w:val="0"/>
+          <w:bCs w:val="0"/>
+          <w:color w:val="auto"/>
+          <w:sz w:val="22"/>
+          <w:szCs w:val="22"/>
+        </w:rPr>
+        <w:t>tests</w:t>
+      </w:r>
+      <w:r>
+        <w:rPr>
+          <w:rFonts w:asciiTheme="minorHAnsi" w:hAnsiTheme="minorHAnsi"/>
+          <w:b w:val="0"/>
+          <w:bCs w:val="0"/>
+          <w:color w:val="auto"/>
+          <w:sz w:val="22"/>
+          <w:szCs w:val="22"/>
+        </w:rPr>
+        <w:t xml:space="preserve"> the program continue</w:t>
+      </w:r>
+      <w:r>
+        <w:rPr>
+          <w:rFonts w:asciiTheme="minorHAnsi" w:hAnsiTheme="minorHAnsi"/>
+          <w:b w:val="0"/>
+          <w:bCs w:val="0"/>
+          <w:color w:val="auto"/>
+          <w:sz w:val="22"/>
+          <w:szCs w:val="22"/>
+        </w:rPr>
+        <w:t xml:space="preserve">d running </w:t>
+      </w:r>
+      <w:r>
+        <w:rPr>
+          <w:rFonts w:asciiTheme="minorHAnsi" w:hAnsiTheme="minorHAnsi"/>
+          <w:b w:val="0"/>
+          <w:bCs w:val="0"/>
+          <w:color w:val="auto"/>
+          <w:sz w:val="22"/>
+          <w:szCs w:val="22"/>
+        </w:rPr>
+        <w:t>normally,</w:t>
+      </w:r>
+      <w:r>
+        <w:rPr>
+          <w:rFonts w:asciiTheme="minorHAnsi" w:hAnsiTheme="minorHAnsi"/>
+          <w:b w:val="0"/>
+          <w:bCs w:val="0"/>
+          <w:color w:val="auto"/>
+          <w:sz w:val="22"/>
+          <w:szCs w:val="22"/>
+        </w:rPr>
+        <w:t xml:space="preserve"> which confirmed </w:t>
+      </w:r>
+      <w:r>
+        <w:rPr>
+          <w:rFonts w:asciiTheme="minorHAnsi" w:hAnsiTheme="minorHAnsi"/>
+          <w:b w:val="0"/>
+          <w:bCs w:val="0"/>
+          <w:color w:val="auto"/>
+          <w:sz w:val="22"/>
+          <w:szCs w:val="22"/>
+        </w:rPr>
+        <w:t>that</w:t>
+      </w:r>
+      <w:r>
+        <w:rPr>
+          <w:rFonts w:asciiTheme="minorHAnsi" w:hAnsiTheme="minorHAnsi"/>
+          <w:b w:val="0"/>
+          <w:bCs w:val="0"/>
+          <w:color w:val="auto"/>
+          <w:sz w:val="22"/>
+          <w:szCs w:val="22"/>
+        </w:rPr>
+        <w:t xml:space="preserve"> the </w:t>
+      </w:r>
+      <w:r>
+        <w:rPr>
+          <w:rFonts w:asciiTheme="minorHAnsi" w:hAnsiTheme="minorHAnsi"/>
+          <w:b w:val="0"/>
+          <w:bCs w:val="0"/>
+          <w:color w:val="auto"/>
+          <w:sz w:val="22"/>
+          <w:szCs w:val="22"/>
+        </w:rPr>
+        <w:t>error</w:t>
+      </w:r>
+      <w:r>
+        <w:rPr>
+          <w:rFonts w:asciiTheme="minorHAnsi" w:hAnsiTheme="minorHAnsi"/>
+          <w:b w:val="0"/>
+          <w:bCs w:val="0"/>
+          <w:color w:val="auto"/>
+          <w:sz w:val="22"/>
+          <w:szCs w:val="22"/>
+        </w:rPr>
+        <w:t xml:space="preserve"> handling was working.</w:t>
+      </w:r>
+    </w:p>
+    <w:p>
+      <w:pPr>
+        <w:pStyle w:val="Heading2"/>
+        <w:spacing w:before="0"/>
+        <w:rPr>
+          <w:rFonts w:asciiTheme="minorHAnsi" w:hAnsiTheme="minorHAnsi"/>
+          <w:b w:val="0"/>
+          <w:bCs w:val="0"/>
+          <w:color w:val="auto"/>
+          <w:sz w:val="22"/>
+          <w:szCs w:val="22"/>
+        </w:rPr>
+      </w:pPr>
+      <w:r>
+        <w:rPr>
+          <w:rFonts w:asciiTheme="minorHAnsi" w:hAnsiTheme="minorHAnsi"/>
+          <w:b w:val="0"/>
+          <w:bCs w:val="0"/>
+          <w:color w:val="auto"/>
+          <w:sz w:val="22"/>
+          <w:szCs w:val="22"/>
+        </w:rPr>
+        <w:t xml:space="preserve"> I attached a screenshot of the error handling below</w:t>
+      </w:r>
+      <w:r>
+        <w:rPr>
+          <w:rFonts w:asciiTheme="minorHAnsi" w:hAnsiTheme="minorHAnsi"/>
+          <w:b w:val="0"/>
+          <w:bCs w:val="0"/>
+          <w:color w:val="auto"/>
+          <w:sz w:val="22"/>
+          <w:szCs w:val="22"/>
+        </w:rPr>
+        <w:t>:</w:t>
+      </w:r>
+    </w:p>
+    <w:p/>
+    <w:p/>
+    <w:p/>
+    <w:p/>
+    <w:p/>
+    <w:p/>
+    <w:p>
+      <w:r>
+        <w:t xml:space="preserve">Screenshot Reference: </w:t>
+      </w:r>
+    </w:p>
+    <w:p>
+      <w:r>
+        <w:rPr>
+          <w:noProof/>
+        </w:rPr>
+        <w:drawing>
+          <wp:inline distT="0" distB="0" distL="0" distR="0" wp14:anchorId="4CAABA19" wp14:editId="248994CD">
+            <wp:extent cx="6052185" cy="2499286"/>
+            <wp:effectExtent l="0" t="0" r="5715" b="0"/>
+            <wp:docPr id="1433069877" name="Picture 1"/>
+            <wp:cNvGraphicFramePr>
+              <a:graphicFrameLocks xmlns:a="http://schemas.openxmlformats.org/drawingml/2006/main" noChangeAspect="1"/>
+            </wp:cNvGraphicFramePr>
+            <a:graphic xmlns:a="http://schemas.openxmlformats.org/drawingml/2006/main">
+              <a:graphicData uri="http://schemas.openxmlformats.org/drawingml/2006/picture">
+                <pic:pic xmlns:pic="http://schemas.openxmlformats.org/drawingml/2006/picture">
+                  <pic:nvPicPr>
+                    <pic:cNvPr id="1433069877" name="Picture 1433069877"/>
+                    <pic:cNvPicPr/>
+                  </pic:nvPicPr>
+                  <pic:blipFill>
+                    <a:blip r:embed="rId9"/>
+                    <a:stretch>
+                      <a:fillRect/>
+                    </a:stretch>
+                  </pic:blipFill>
+                  <pic:spPr>
+                    <a:xfrm>
+                      <a:off x="0" y="0"/>
+                      <a:ext cx="6073434" cy="2508061"/>
+                    </a:xfrm>
+                    <a:prstGeom prst="rect">
+                      <a:avLst/>
+                    </a:prstGeom>
+                  </pic:spPr>
+                </pic:pic>
+              </a:graphicData>
+            </a:graphic>
+          </wp:inline>
+        </w:drawing>
       </w:r>
     </w:p>
     <w:p>
@@ -639,6 +990,81 @@
           <w:color w:val="auto"/>
         </w:rPr>
       </w:pPr>
+    </w:p>
+    <w:p>
+      <w:pPr>
+        <w:pStyle w:val="Heading2"/>
+        <w:rPr>
+          <w:color w:val="auto"/>
+        </w:rPr>
+      </w:pPr>
+      <w:r>
+        <w:rPr>
+          <w:color w:val="auto"/>
+        </w:rPr>
+        <w:t>Conclusion</w:t>
+      </w:r>
+    </w:p>
+    <w:p>
+      <w:r>
+        <w:t>The debugging process identified two TypeErrors caused by</w:t>
+      </w:r>
+      <w:r>
+        <w:t xml:space="preserve"> the</w:t>
+      </w:r>
+      <w:r>
+        <w:t xml:space="preserve"> inconsistent data types</w:t>
+      </w:r>
+      <w:r>
+        <w:t xml:space="preserve"> (string and float)</w:t>
+      </w:r>
+      <w:r>
+        <w:t xml:space="preserve"> Using PyCharm’s debugging tools allowed </w:t>
+      </w:r>
+      <w:r>
+        <w:t>me</w:t>
+      </w:r>
+      <w:r>
+        <w:t xml:space="preserve"> to </w:t>
+      </w:r>
+      <w:r>
+        <w:t xml:space="preserve">look at </w:t>
+      </w:r>
+      <w:r>
+        <w:t xml:space="preserve">the </w:t>
+      </w:r>
+      <w:r>
+        <w:t>variable</w:t>
+      </w:r>
+      <w:r>
+        <w:t xml:space="preserve">s and find the exact </w:t>
+      </w:r>
+      <w:r>
+        <w:t>error location. After</w:t>
+      </w:r>
+      <w:r>
+        <w:t xml:space="preserve"> putting </w:t>
+      </w:r>
+      <w:r>
+        <w:t xml:space="preserve">input validation, type conversion, and error handling, the program now runs and produces </w:t>
+      </w:r>
+      <w:r>
+        <w:t xml:space="preserve">the </w:t>
+      </w:r>
+      <w:r>
+        <w:t>correct output</w:t>
+      </w:r>
+      <w:r>
+        <w:t xml:space="preserve"> without crashing even with errors.</w:t>
+      </w:r>
+    </w:p>
+    <w:p>
+      <w:pPr>
+        <w:pStyle w:val="Heading2"/>
+        <w:rPr>
+          <w:color w:val="auto"/>
+        </w:rPr>
+      </w:pPr>
       <w:r>
         <w:rPr>
           <w:color w:val="auto"/>
@@ -647,12 +1073,20 @@
       </w:r>
     </w:p>
     <w:p>
-      <w:r>
-        <w:t>https://github.com/ggriaa/COP2373</w:t>
-      </w:r>
-      <w:r>
-        <w:t>/</w:t>
-      </w:r>
+      <w:hyperlink r:id="rId10" w:history="1">
+        <w:r>
+          <w:rPr>
+            <w:rStyle w:val="Hyperlink"/>
+          </w:rPr>
+          <w:t>https://github.com/ggriaa/COP2373</w:t>
+        </w:r>
+        <w:r>
+          <w:rPr>
+            <w:rStyle w:val="Hyperlink"/>
+          </w:rPr>
+          <w:t>/</w:t>
+        </w:r>
+      </w:hyperlink>
     </w:p>
     <w:p>
       <w:pPr>
@@ -12254,6 +12688,29 @@
       </w:tcPr>
     </w:tblStylePr>
   </w:style>
+  <w:style w:type="character" w:styleId="Hyperlink">
+    <w:name w:val="Hyperlink"/>
+    <w:basedOn w:val="DefaultParagraphFont"/>
+    <w:uiPriority w:val="99"/>
+    <w:unhideWhenUsed/>
+    <w:rsid w:val="00A45FA2"/>
+    <w:rPr>
+      <w:color w:val="0000FF" w:themeColor="hyperlink"/>
+      <w:u w:val="single"/>
+    </w:rPr>
+  </w:style>
+  <w:style w:type="character" w:styleId="UnresolvedMention">
+    <w:name w:val="Unresolved Mention"/>
+    <w:basedOn w:val="DefaultParagraphFont"/>
+    <w:uiPriority w:val="99"/>
+    <w:semiHidden/>
+    <w:unhideWhenUsed/>
+    <w:rsid w:val="00A45FA2"/>
+    <w:rPr>
+      <w:color w:val="605E5C"/>
+      <w:shd w:val="clear" w:color="auto" w:fill="E1DFDD"/>
+    </w:rPr>
+  </w:style>
 </w:styles>
 </file>
 

</xml_diff>